<commit_message>
Contratti aziende: niente avviamento né durata minima (già clienti), pagamento a 7 giorni
Co-Authored-By: Claude Opus 5.5 <noreply@anthropic.com>
Claude-Session: https://claude.ai/code/session_01WggD5zVqy5TCJTD9M5VXmn
</commit_message>
<xml_diff>
--- a/contratti/clienti_aziende/Contratto_BB_Hospitality_Alex_Biancotti.docx
+++ b/contratti/clienti_aziende/Contratto_BB_Hospitality_Alex_Biancotti.docx
@@ -328,6 +328,22 @@
         <w:spacing w:before="124" w:line="362" w:lineRule="auto"/>
       </w:pPr>
       <w:r>
+        <w:t xml:space="preserve">Le Parti intrattengono già un rapporto di collaborazione per la gestione dell’Immobile, che con il presente Contratto intendono disciplinare in modo aggiornato, anche a seguito dello svolgimento dell’attività del Property Manager in forma societaria;</w:t>
+      </w:r>
+    </w:p>
+    <w:p>
+      <w:pPr>
+        <w:pStyle w:val="Paragrafoelenco"/>
+        <w:numPr>
+          <w:ilvl w:val="0"/>
+          <w:numId w:val="12"/>
+        </w:numPr>
+        <w:tabs>
+          <w:tab w:val="left" w:pos="1426"/>
+        </w:tabs>
+        <w:spacing w:before="124" w:line="362" w:lineRule="auto"/>
+      </w:pPr>
+      <w:r>
         <w:t xml:space="preserve">Il Mandante, al fine di ottimizzare la gestione dei rapporti contrattuali con i </w:t>
       </w:r>
       <w:r>
@@ -1962,7 +1978,7 @@
         <w:rPr>
           <w:b/>
         </w:rPr>
-        <w:t xml:space="preserve">Al termine di ciascun mese solare il Property Manager emette fattura al Mandante per il compenso di cui all’art. 11 maturato sui pernottamenti del mese, oltre IVA, unitamente agli eventuali costi a carico del Mandante sostenuti dal Property Manager nel medesimo mese, e mette a disposizione il rendiconto delle prenotazioni di cui all’art. 4. Il Mandante provvede al pagamento entro 15 (quindici) giorni dal ricevimento della fattura.</w:t>
+        <w:t xml:space="preserve">Al termine di ciascun mese solare il Property Manager emette fattura al Mandante per il compenso di cui all’art. 11 maturato sui pernottamenti del mese, oltre IVA, unitamente agli eventuali costi a carico del Mandante sostenuti dal Property Manager nel medesimo mese, e mette a disposizione il rendiconto delle prenotazioni di cui all’art. 4. Il Mandante provvede al pagamento entro 7 (sette) giorni dal ricevimento della fattura.</w:t>
       </w:r>
     </w:p>
     <w:p>
@@ -2027,17 +2043,6 @@
     <w:p>
       <w:pPr>
         <w:pStyle w:val="Corpotesto"/>
-        <w:spacing w:before="1" w:line="360" w:lineRule="auto"/>
-        <w:ind w:hanging="1"/>
-        <w:jc w:val="both"/>
-      </w:pPr>
-      <w:r>
-        <w:t xml:space="preserve">Le attività di avviamento svolte dal Property Manager (a titolo esemplificativo: ottimizzazione degli annunci, configurazione del gestionale, pratiche amministrative iniziali, consulenza per l’allestimento) hanno un valore convenzionalmente determinato in euro 500,00 (cinquecento/00) oltre IVA. Tale importo non è dovuto dal Mandante, salvo il caso di cessazione anticipata del Contratto prima che sia decorso 1 (un) anno dalla sua sottoscrizione, secondo quanto previsto dall’art. 16.</w:t>
-      </w:r>
-    </w:p>
-    <w:p>
-      <w:pPr>
-        <w:pStyle w:val="Corpotesto"/>
         <w:spacing w:before="120" w:line="360" w:lineRule="auto"/>
         <w:jc w:val="both"/>
       </w:pPr>
@@ -2062,7 +2067,7 @@
         <w:jc w:val="both"/>
       </w:pPr>
       <w:r>
-        <w:t xml:space="preserve">Fatto salvo quanto previsto dal presente articolo e dagli artt. 13, 14, 16 e 17, null’altro sarà dovuto dal Mandante al Property Manager.</w:t>
+        <w:t xml:space="preserve">Fatto salvo quanto previsto dal presente articolo e dagli artt. 13, 14 e 17, null’altro sarà dovuto dal Mandante al Property Manager.</w:t>
       </w:r>
     </w:p>
     <w:p>
@@ -2485,7 +2490,7 @@
       </w:pPr>
       <w:r>
         <w:rPr/>
-        <w:t xml:space="preserve">Fermo quanto previsto dal successivo comma in merito alla durata minima, ciascuna Parte potrà recedere dal Contratto mediante comunicazione scritta da inviarsi all’altra Parte a mezzo raccomandata A/R o PEC, con un preavviso di 2 (due) mesi. Il recesso avrà effetto a decorrere dall’ultimo giorno del secondo mese solare successivo a quello in cui la relativa comunicazione sarà pervenuta all’altra Parte.</w:t>
+        <w:t xml:space="preserve">Ciascuna Parte potrà recedere dal Contratto mediante comunicazione scritta da inviarsi all’altra Parte a mezzo raccomandata A/R o PEC, con un preavviso di 2 (due) mesi. Il recesso avrà effetto a decorrere dall’ultimo giorno del secondo mese solare successivo a quello in cui la relativa comunicazione sarà pervenuta all’altra Parte.</w:t>
       </w:r>
     </w:p>
     <w:p>
@@ -2500,30 +2505,6 @@
       <w:r>
         <w:t xml:space="preserve"> </w:t>
       </w:r>
-    </w:p>
-    <w:p>
-      <w:pPr>
-        <w:pStyle w:val="Corpotesto"/>
-        <w:spacing w:before="120" w:line="360" w:lineRule="auto"/>
-        <w:jc w:val="both"/>
-      </w:pPr>
-      <w:r>
-        <w:t xml:space="preserve">Le Parti convengono una durata minima del Contratto di 6 (sei) mesi dalla data di sottoscrizione. Pertanto il recesso non può essere comunicato prima che siano decorsi 4 (quattro) mesi dalla sottoscrizione; l’eventuale comunicazione pervenuta prima di tale termine si intenderà ricevuta il giorno successivo alla sua scadenza. In ogni caso il Contratto non potrà cessare per recesso prima che siano decorsi 6 (sei) mesi dalla sua sottoscrizione. Qualora il Contratto cessi per recesso del Mandante, o per risoluzione dovuta a inadempimento del Mandante, prima che sia decorso 1 (un) anno dalla sottoscrizione, il Mandante corrisponderà al Property Manager il rimborso forfettario dei costi di avviamento pari a euro 500,00 (cinquecento/00) oltre IVA, di cui all’art. 11.</w:t>
-      </w:r>
-    </w:p>
-    <w:p>
-      <w:pPr>
-        <w:pStyle w:val="Corpotesto"/>
-        <w:spacing w:before="120" w:line="360" w:lineRule="auto"/>
-        <w:jc w:val="both"/>
-        <w:rPr/>
-      </w:pPr>
-      <w:r>
-        <w:rPr/>
-        <w:t xml:space="preserve">Il rimborso forfettario di cui al comma precedente non è dovuto qualora il Contratto cessi per recesso del Property Manager o per risoluzione dovuta a inadempimento del Property Manager. È fatturato dal Property Manager e pagato dal Mandante ai sensi dell’art. 10.</w:t>
-      </w:r>
-      <w:proofErr w:type="spellStart"/>
-      <w:proofErr w:type="spellEnd"/>
     </w:p>
     <w:p>
       <w:pPr>
@@ -3387,7 +3368,7 @@
         <w:ind w:left="360"/>
       </w:pPr>
       <w:r>
-        <w:t xml:space="preserve">11) Compenso del Property Manager (rimborso forfettario dei costi di avviamento);</w:t>
+        <w:t xml:space="preserve">11) Compenso del Property Manager;</w:t>
       </w:r>
     </w:p>
     <w:p>

</xml_diff>

<commit_message>
Contratti aziende: fine mandato 30% del compenso, base al netto pulizie, gestionale 3 unità a 9 euro
Co-Authored-By: Claude Opus 5.5 <noreply@anthropic.com>
Claude-Session: https://claude.ai/code/session_01WggD5zVqy5TCJTD9M5VXmn
</commit_message>
<xml_diff>
--- a/contratti/clienti_aziende/Contratto_BB_Hospitality_Alex_Biancotti.docx
+++ b/contratti/clienti_aziende/Contratto_BB_Hospitality_Alex_Biancotti.docx
@@ -181,7 +181,7 @@
         <w:jc w:val="both"/>
       </w:pPr>
       <w:r>
-        <w:t xml:space="preserve">Il Mandante è proprietario (ovvero titolare di altro diritto reale o personale di godimento) delle seguenti 4 (quattro) unità immobiliari, ciascuna oggetto di un distinto annuncio sulle piattaforme di prenotazione (di seguito, singolarmente e congiuntamente, l’“Immobile”, intendendosi ogni riferimento all’Immobile contenuto nel presente Contratto riferito a ciascuna di esse): (1) sita in ______________________ (____), Via ______________________ n. ____, interno ____, piano ____, NCEU del Comune di ______________________ Foglio ____, Mapp. ____, Sub. ____, Cat. ____; (2) sita in ______________________ (____), Via ______________________ n. ____, interno ____, piano ____, NCEU del Comune di ______________________ Foglio ____, Mapp. ____, Sub. ____, Cat. ____; (3) sita in ______________________ (____), Via ______________________ n. ____, interno ____, piano ____, NCEU del Comune di ______________________ Foglio ____, Mapp. ____, Sub. ____, Cat. ____; (4) sita in ______________________ (____), Via ______________________ n. ____, interno ____, piano ____, NCEU del Comune di ______________________ Foglio ____, Mapp. ____, Sub. ____, Cat. ____;</w:t>
+        <w:t xml:space="preserve">Il Mandante è proprietario (ovvero titolare di altro diritto reale o personale di godimento) delle seguenti 2 (due) unità immobiliari, promosse sulle piattaforme di prenotazione sia singolarmente sia congiuntamente (di seguito, singolarmente e congiuntamente, l’“Immobile”, intendendosi ogni riferimento all’Immobile contenuto nel presente Contratto riferito a ciascuna di esse): (1) sita in ______________________ (____), Via ______________________ n. ____, interno ____, piano ____, NCEU del Comune di ______________________ Foglio ____, Mapp. ____, Sub. ____, Cat. ____; (2) sita in ______________________ (____), Via ______________________ n. ____, interno ____, piano ____, NCEU del Comune di ______________________ Foglio ____, Mapp. ____, Sub. ____, Cat. ____;</w:t>
       </w:r>
     </w:p>
     <w:p>
@@ -2047,7 +2047,7 @@
         <w:jc w:val="both"/>
       </w:pPr>
       <w:r>
-        <w:t xml:space="preserve">Per l’attività di gestione e per i servizi di cui all’art. 2, al Property Manager spetta un compenso pari al 10% (dieci per cento) del Costo del Pernottamento di ciascuna prenotazione, oltre IVA. Per “Costo del Pernottamento” si intende il prezzo dei pernottamenti dovuto dall’Ospite, come risultante dalla prenotazione, al netto delle commissioni trattenute dalle piattaforme di prenotazione ed escluse l’imposta di soggiorno, l’eventuale deposito cauzionale, le spese di pulizia finale eventualmente addebitate separatamente all’Ospite e le commissioni di servizio addebitate all’Ospite dalle piattaforme. Al Property Manager spetta inoltre, per l’utilizzo del gestionale Kross Booking, un canone mensile di euro 9,00 (nove/00) oltre IVA per ciascun annuncio gestito, pari a complessivi euro 36,00 (trentasei/00) oltre IVA al mese per i 4 (quattro) annunci gestiti alla data di sottoscrizione, fatturato con il compenso mensile ai sensi dell’art. 10.</w:t>
+        <w:t xml:space="preserve">Per l’attività di gestione e per i servizi di cui all’art. 2, al Property Manager spetta un compenso pari al 10% (dieci per cento) del Costo del Pernottamento di ciascuna prenotazione, oltre IVA. Per “Costo del Pernottamento” si intende il prezzo dei pernottamenti dovuto dall’Ospite, come risultante dalla prenotazione, al netto delle commissioni trattenute dalle piattaforme di prenotazione e delle spese di pulizia relative al soggiorno, ed esclusi l’imposta di soggiorno, l’eventuale deposito cauzionale e le commissioni di servizio addebitate all’Ospite dalle piattaforme. Al Property Manager spetta inoltre, per l’utilizzo del gestionale Kross Booking, un canone mensile di euro 9,00 (nove/00) oltre IVA per ciascuna unità configurata sul gestionale, pari a complessivi euro 27,00 (ventisette/00) oltre IVA al mese per le 3 (tre) unità configurate alla data di sottoscrizione (le 2 unità immobiliari e l’unità aggiuntiva che le comprende entrambe, utilizzata per la loro locazione congiunta), fatturato con il compenso mensile ai sensi dell’art. 10.</w:t>
       </w:r>
     </w:p>
     <w:p>
@@ -2561,7 +2561,7 @@
         <w:jc w:val="both"/>
       </w:pPr>
       <w:r>
-        <w:t xml:space="preserve">A fronte dell’attività di promozione e acquisizione svolta, per le Prenotazioni Future il Mandante riconosce al Property Manager un compenso forfettario (il “Compenso di Fine Mandato”) pari al 30% (trenta per cento) del Costo del Pernottamento, come definito all’art. 11, relativo ai pernottamenti successivi alla data di cessazione.</w:t>
+        <w:t xml:space="preserve">A fronte dell’attività di promozione e acquisizione svolta, per le Prenotazioni Future il Mandante riconosce al Property Manager un compenso forfettario (il “Compenso di Fine Mandato”) pari al 30% (trenta per cento) del compenso che sarebbe spettato al Property Manager ai sensi dell’art. 11 sul Costo del Pernottamento relativo ai pernottamenti successivi alla data di cessazione.</w:t>
       </w:r>
     </w:p>
     <w:p>

</xml_diff>